<commit_message>
docs: project docs suite - progress tracker, newbie/dev guides, LLD
- TIEN_DO_DU_AN.md: status, completed features, recent changes,
  source health table, backlog, test checklist
- HUONG_DAN_SU_DUNG_NEWBIE.md: zero-knowledge setup and daily usage
- HUONG_DAN_DEV.md: dev workflow, Viettel-specific constraints, pitfalls
- LLD.md: architecture, tech stack, module design, sequences, data model
- README.md: refresh (Gemini not Claude, doc index, current features)
- HUONG_DAN_TEST_API_NETCHAT.docx: mark reaction/channel/member APIs
  as not-used-in-project (kept for reference)

Co-Authored-By: Claude Fable 5 <noreply@anthropic.com>
</commit_message>
<xml_diff>
--- a/HUONG_DAN_TEST_API_NETCHAT.docx
+++ b/HUONG_DAN_TEST_API_NETCHAT.docx
@@ -2796,7 +2796,19 @@
         <w:pStyle w:val="Heading2"/>
       </w:pPr>
       <w:r>
-        <w:t xml:space="preserve">4.3. Thả reaction vào tin nhắn</w:t>
+        <w:t xml:space="preserve">4.3. Thả reaction vào tin nhắn — KHÔNG SỬ DỤNG</w:t>
+      </w:r>
+    </w:p>
+    <w:p>
+      <w:pPr>
+        <w:spacing w:after="120"/>
+      </w:pPr>
+      <w:r>
+        <w:rPr>
+          <w:b/>
+          <w:color w:val="C00000"/>
+        </w:rPr>
+        <w:t xml:space="preserve">⚠️ KHÔNG SỬ DỤNG để code dự án baocaoxuthe — giữ lại để tham khảo khi cần dùng sau này.</w:t>
       </w:r>
     </w:p>
     <w:p>
@@ -2876,7 +2888,19 @@
         <w:pStyle w:val="Heading2"/>
       </w:pPr>
       <w:r>
-        <w:t xml:space="preserve">4.4. Tạo channel mới</w:t>
+        <w:t xml:space="preserve">4.4. Tạo channel mới — KHÔNG SỬ DỤNG</w:t>
+      </w:r>
+    </w:p>
+    <w:p>
+      <w:pPr>
+        <w:spacing w:after="120"/>
+      </w:pPr>
+      <w:r>
+        <w:rPr>
+          <w:b/>
+          <w:color w:val="C00000"/>
+        </w:rPr>
+        <w:t xml:space="preserve">⚠️ KHÔNG SỬ DỤNG để code dự án baocaoxuthe — giữ lại để tham khảo khi cần dùng sau này.</w:t>
       </w:r>
     </w:p>
     <w:p>
@@ -3000,7 +3024,19 @@
         <w:pStyle w:val="Heading2"/>
       </w:pPr>
       <w:r>
-        <w:t xml:space="preserve">4.5. Quản lý thành viên channel</w:t>
+        <w:t xml:space="preserve">4.5. Quản lý thành viên channel — KHÔNG SỬ DỤNG</w:t>
+      </w:r>
+    </w:p>
+    <w:p>
+      <w:pPr>
+        <w:spacing w:after="120"/>
+      </w:pPr>
+      <w:r>
+        <w:rPr>
+          <w:b/>
+          <w:color w:val="C00000"/>
+        </w:rPr>
+        <w:t xml:space="preserve">⚠️ KHÔNG SỬ DỤNG để code dự án baocaoxuthe — giữ lại để tham khảo khi cần dùng sau này.</w:t>
       </w:r>
     </w:p>
     <w:p>

</xml_diff>